<commit_message>
Add/update resource data for AquiferOpenStudyNotesProfiles
</commit_message>
<xml_diff>
--- a/arb/docx/001.content.docx
+++ b/arb/docx/001.content.docx
@@ -22,7 +22,7 @@
         <w:rPr>
           <w:lang w:val="ar_AE" w:bidi="ar_AE"/>
         </w:rPr>
-        <w:t>Resource: Study Notes - Profiles (Tyndale)</w:t>
+        <w:t>Resource: Tyndale Open Study Notes</w:t>
       </w:r>
       <w:r>
         <w:rPr>
@@ -122,7 +122,7 @@
         <w:rPr>
           <w:lang w:val="ar_AE" w:bidi="ar_AE"/>
         </w:rPr>
-        <w:t>Study Notes - Profiles (Tyndale)</w:t>
+        <w:t>Tyndale Open Study Notes</w:t>
       </w:r>
     </w:p>
     <w:p>
@@ -163,28 +163,6 @@
           <w:lang w:val="ar_AE" w:bidi="ar_AE"/>
         </w:rPr>
         <w:t>ا</w:t>
-      </w:r>
-      <w:r>
-        <w:rPr>
-          <w:lang w:val="ar_AE" w:bidi="ar_AE"/>
-        </w:rPr>
-      </w:r>
-    </w:p>
-    <w:p>
-      <w:pPr>
-        <w:bidi/>
-      </w:pPr>
-      <w:r>
-        <w:rPr>
-          <w:lang w:val="ar_AE" w:bidi="ar_AE"/>
-        </w:rPr>
-      </w:r>
-      <w:r>
-        <w:rPr>
-          <w:i/>
-          <w:lang w:val="ar_AE" w:bidi="ar_AE"/>
-        </w:rPr>
-        <w:t>آحَاز, آدَم، وحَوَّاء, آسا, إبراهيم, أبْشَالُوم, أَبْشَاي, أَبُلُّوس, ابن الإنسان, أَبْنَيْر, أَبِيَاثَار, أحَشْوِيرُوش الأول, أَخْآب, إرميا, أَسْتِير, إسحاق, إسماعيل, إِشَعْيَاء, أشّور, أَفَسُس, الآراميون, الأباطرة الرومان, أَلِعَازَار, أَلِيشَع, أنطيوخوس الرابع, إِيزَابَل, إِيلِيَّا التِّشْبِي, ٱستفانوس</w:t>
       </w:r>
       <w:r>
         <w:rPr>

</xml_diff>